<commit_message>
Publish verified user guide updates automatically
</commit_message>
<xml_diff>
--- a/assets/user-guide/V4 User Guide.docx
+++ b/assets/user-guide/V4 User Guide.docx
@@ -3061,6 +3061,178 @@
     </w:p>
     <w:p>
       <w:pPr>
+        <w:pStyle w:val="Heading1"/>
+      </w:pPr>
+      <w:r>
+        <w:rPr>
+          <w:highlight w:val="yellow"/>
+        </w:rPr>
+        <w:t>New feature: Return to the V4 launcher from GIS</w:t>
+      </w:r>
+    </w:p>
+    <w:p>
+      <w:r>
+        <w:rPr>
+          <w:highlight w:val="yellow"/>
+        </w:rPr>
+        <w:t>Section: Open GIS and return to the V4 launcher</w:t>
+      </w:r>
+    </w:p>
+    <w:p>
+      <w:r>
+        <w:rPr>
+          <w:highlight w:val="yellow"/>
+        </w:rPr>
+        <w:t>1. Select Open GIS on the GIS card in the V4 launcher.</w:t>
+      </w:r>
+    </w:p>
+    <w:p>
+      <w:r>
+        <w:rPr>
+          <w:highlight w:val="yellow"/>
+        </w:rPr>
+        <w:t>2. Use the browser Back control to return to the V4 launcher.</w:t>
+      </w:r>
+    </w:p>
+    <w:tbl>
+      <w:tblPr>
+        <w:tblW w:type="auto" w:w="0"/>
+        <w:tblLook w:firstColumn="1" w:firstRow="1" w:lastColumn="0" w:lastRow="0" w:noHBand="0" w:noVBand="1" w:val="04A0"/>
+      </w:tblPr>
+      <w:tblGrid>
+        <w:gridCol w:w="9633"/>
+      </w:tblGrid>
+      <w:tr>
+        <w:tc>
+          <w:tcPr>
+            <w:tcW w:type="dxa" w:w="9633"/>
+            <w:shd w:fill="FFFF00"/>
+          </w:tcPr>
+          <w:p>
+            <w:pPr>
+              <w:jc w:val="center"/>
+            </w:pPr>
+            <w:r>
+              <w:drawing>
+                <wp:inline xmlns:a="http://schemas.openxmlformats.org/drawingml/2006/main" xmlns:pic="http://schemas.openxmlformats.org/drawingml/2006/picture">
+                  <wp:extent cx="5577840" cy="3486150"/>
+                  <wp:docPr id="1" name="Picture 1"/>
+                  <wp:cNvGraphicFramePr>
+                    <a:graphicFrameLocks noChangeAspect="1"/>
+                  </wp:cNvGraphicFramePr>
+                  <a:graphic>
+                    <a:graphicData uri="http://schemas.openxmlformats.org/drawingml/2006/picture">
+                      <pic:pic>
+                        <pic:nvPicPr>
+                          <pic:cNvPr id="0" name="criterion-1-final.png"/>
+                          <pic:cNvPicPr/>
+                        </pic:nvPicPr>
+                        <pic:blipFill>
+                          <a:blip r:embed="rId10"/>
+                          <a:stretch>
+                            <a:fillRect/>
+                          </a:stretch>
+                        </pic:blipFill>
+                        <pic:spPr>
+                          <a:xfrm>
+                            <a:off x="0" y="0"/>
+                            <a:ext cx="5577840" cy="3486150"/>
+                          </a:xfrm>
+                          <a:prstGeom prst="rect"/>
+                        </pic:spPr>
+                      </pic:pic>
+                    </a:graphicData>
+                  </a:graphic>
+                </wp:inline>
+              </w:drawing>
+            </w:r>
+          </w:p>
+          <w:p>
+            <w:r>
+              <w:rPr>
+                <w:highlight w:val="yellow"/>
+              </w:rPr>
+              <w:t>Figure 1: Select Open GIS on the GIS card in the V4 launcher.</w:t>
+            </w:r>
+          </w:p>
+        </w:tc>
+      </w:tr>
+    </w:tbl>
+    <w:tbl>
+      <w:tblPr>
+        <w:tblW w:type="auto" w:w="0"/>
+        <w:tblLook w:firstColumn="1" w:firstRow="1" w:lastColumn="0" w:lastRow="0" w:noHBand="0" w:noVBand="1" w:val="04A0"/>
+      </w:tblPr>
+      <w:tblGrid>
+        <w:gridCol w:w="9633"/>
+      </w:tblGrid>
+      <w:tr>
+        <w:tc>
+          <w:tcPr>
+            <w:tcW w:type="dxa" w:w="9633"/>
+            <w:shd w:fill="FFFF00"/>
+          </w:tcPr>
+          <w:p>
+            <w:pPr>
+              <w:jc w:val="center"/>
+            </w:pPr>
+            <w:r>
+              <w:drawing>
+                <wp:inline xmlns:a="http://schemas.openxmlformats.org/drawingml/2006/main" xmlns:pic="http://schemas.openxmlformats.org/drawingml/2006/picture">
+                  <wp:extent cx="5577840" cy="3486150"/>
+                  <wp:docPr id="2" name="Picture 2"/>
+                  <wp:cNvGraphicFramePr>
+                    <a:graphicFrameLocks noChangeAspect="1"/>
+                  </wp:cNvGraphicFramePr>
+                  <a:graphic>
+                    <a:graphicData uri="http://schemas.openxmlformats.org/drawingml/2006/picture">
+                      <pic:pic>
+                        <pic:nvPicPr>
+                          <pic:cNvPr id="0" name="criterion-2-final.png"/>
+                          <pic:cNvPicPr/>
+                        </pic:nvPicPr>
+                        <pic:blipFill>
+                          <a:blip r:embed="rId11"/>
+                          <a:stretch>
+                            <a:fillRect/>
+                          </a:stretch>
+                        </pic:blipFill>
+                        <pic:spPr>
+                          <a:xfrm>
+                            <a:off x="0" y="0"/>
+                            <a:ext cx="5577840" cy="3486150"/>
+                          </a:xfrm>
+                          <a:prstGeom prst="rect"/>
+                        </pic:spPr>
+                      </pic:pic>
+                    </a:graphicData>
+                  </a:graphic>
+                </wp:inline>
+              </w:drawing>
+            </w:r>
+          </w:p>
+          <w:p>
+            <w:r>
+              <w:rPr>
+                <w:highlight w:val="yellow"/>
+              </w:rPr>
+              <w:t>Figure 2: Use the browser Back control to return to the V4 launcher.</w:t>
+            </w:r>
+          </w:p>
+        </w:tc>
+      </w:tr>
+    </w:tbl>
+    <w:p>
+      <w:r>
+        <w:rPr>
+          <w:vanish/>
+          <w:highlight w:val="yellow"/>
+        </w:rPr>
+        <w:t>[[AUTO_GUIDE_UPDATE:TEST2-32]]</w:t>
+      </w:r>
+    </w:p>
+    <w:p>
+      <w:pPr>
         <w:pStyle w:val="Caption"/>
       </w:pPr>
       <w:r>

</xml_diff>

<commit_message>
Publish TEST2 TEST2-28 agent output
</commit_message>
<xml_diff>
--- a/assets/user-guide/V4 User Guide.docx
+++ b/assets/user-guide/V4 User Guide.docx
@@ -3233,6 +3233,266 @@
     </w:p>
     <w:p>
       <w:pPr>
+        <w:pStyle w:val="Heading1"/>
+      </w:pPr>
+      <w:r>
+        <w:rPr>
+          <w:highlight w:val="yellow"/>
+        </w:rPr>
+        <w:t>Updated guidance: Navigate from the V4 launcher to Agentic AI</w:t>
+      </w:r>
+    </w:p>
+    <w:p>
+      <w:r>
+        <w:rPr>
+          <w:highlight w:val="yellow"/>
+        </w:rPr>
+        <w:t>Section: Navigating the V4 launcher and opening Agentic AI</w:t>
+      </w:r>
+    </w:p>
+    <w:p>
+      <w:r>
+        <w:rPr>
+          <w:highlight w:val="yellow"/>
+        </w:rPr>
+        <w:t>1. Open the V4 launcher.</w:t>
+      </w:r>
+    </w:p>
+    <w:p>
+      <w:r>
+        <w:rPr>
+          <w:highlight w:val="yellow"/>
+        </w:rPr>
+        <w:t>2. Select Open on the Agentic AI module card.</w:t>
+      </w:r>
+    </w:p>
+    <w:p>
+      <w:r>
+        <w:rPr>
+          <w:highlight w:val="yellow"/>
+        </w:rPr>
+        <w:t>3. Confirm that the Agentic AI module opens at /agentic-ai.</w:t>
+      </w:r>
+    </w:p>
+    <w:p>
+      <w:r>
+        <w:rPr>
+          <w:highlight w:val="yellow"/>
+        </w:rPr>
+        <w:t>4. Use your browser's Back button to return to the launcher.</w:t>
+      </w:r>
+    </w:p>
+    <w:p>
+      <w:r>
+        <w:rPr>
+          <w:highlight w:val="yellow"/>
+        </w:rPr>
+        <w:t>5. Confirm that the launcher returns at /launcher with its module cards available.</w:t>
+      </w:r>
+    </w:p>
+    <w:tbl>
+      <w:tblPr>
+        <w:tblW w:type="auto" w:w="0"/>
+        <w:tblLook w:firstColumn="1" w:firstRow="1" w:lastColumn="0" w:lastRow="0" w:noHBand="0" w:noVBand="1" w:val="04A0"/>
+      </w:tblPr>
+      <w:tblGrid>
+        <w:gridCol w:w="9633"/>
+      </w:tblGrid>
+      <w:tr>
+        <w:tc>
+          <w:tcPr>
+            <w:tcW w:type="dxa" w:w="9633"/>
+            <w:shd w:fill="FFFF00"/>
+          </w:tcPr>
+          <w:p>
+            <w:pPr>
+              <w:jc w:val="center"/>
+            </w:pPr>
+            <w:r>
+              <w:drawing>
+                <wp:inline xmlns:a="http://schemas.openxmlformats.org/drawingml/2006/main" xmlns:pic="http://schemas.openxmlformats.org/drawingml/2006/picture">
+                  <wp:extent cx="5577840" cy="3486150"/>
+                  <wp:docPr id="3" name="Picture 3"/>
+                  <wp:cNvGraphicFramePr>
+                    <a:graphicFrameLocks noChangeAspect="1"/>
+                  </wp:cNvGraphicFramePr>
+                  <a:graphic>
+                    <a:graphicData uri="http://schemas.openxmlformats.org/drawingml/2006/picture">
+                      <pic:pic>
+                        <pic:nvPicPr>
+                          <pic:cNvPr id="0" name="criterion-1-final.png"/>
+                          <pic:cNvPicPr/>
+                        </pic:nvPicPr>
+                        <pic:blipFill>
+                          <a:blip r:embed="rId12"/>
+                          <a:stretch>
+                            <a:fillRect/>
+                          </a:stretch>
+                        </pic:blipFill>
+                        <pic:spPr>
+                          <a:xfrm>
+                            <a:off x="0" y="0"/>
+                            <a:ext cx="5577840" cy="3486150"/>
+                          </a:xfrm>
+                          <a:prstGeom prst="rect"/>
+                        </pic:spPr>
+                      </pic:pic>
+                    </a:graphicData>
+                  </a:graphic>
+                </wp:inline>
+              </w:drawing>
+            </w:r>
+          </w:p>
+          <w:p>
+            <w:r>
+              <w:rPr>
+                <w:highlight w:val="yellow"/>
+              </w:rPr>
+              <w:t>Figure 1: Open the V4 launcher.</w:t>
+            </w:r>
+          </w:p>
+        </w:tc>
+      </w:tr>
+    </w:tbl>
+    <w:tbl>
+      <w:tblPr>
+        <w:tblW w:type="auto" w:w="0"/>
+        <w:tblLook w:firstColumn="1" w:firstRow="1" w:lastColumn="0" w:lastRow="0" w:noHBand="0" w:noVBand="1" w:val="04A0"/>
+      </w:tblPr>
+      <w:tblGrid>
+        <w:gridCol w:w="9633"/>
+      </w:tblGrid>
+      <w:tr>
+        <w:tc>
+          <w:tcPr>
+            <w:tcW w:type="dxa" w:w="9633"/>
+            <w:shd w:fill="FFFF00"/>
+          </w:tcPr>
+          <w:p>
+            <w:pPr>
+              <w:jc w:val="center"/>
+            </w:pPr>
+            <w:r>
+              <w:drawing>
+                <wp:inline xmlns:a="http://schemas.openxmlformats.org/drawingml/2006/main" xmlns:pic="http://schemas.openxmlformats.org/drawingml/2006/picture">
+                  <wp:extent cx="5577840" cy="3486150"/>
+                  <wp:docPr id="4" name="Picture 4"/>
+                  <wp:cNvGraphicFramePr>
+                    <a:graphicFrameLocks noChangeAspect="1"/>
+                  </wp:cNvGraphicFramePr>
+                  <a:graphic>
+                    <a:graphicData uri="http://schemas.openxmlformats.org/drawingml/2006/picture">
+                      <pic:pic>
+                        <pic:nvPicPr>
+                          <pic:cNvPr id="0" name="criterion-2-final.png"/>
+                          <pic:cNvPicPr/>
+                        </pic:nvPicPr>
+                        <pic:blipFill>
+                          <a:blip r:embed="rId13"/>
+                          <a:stretch>
+                            <a:fillRect/>
+                          </a:stretch>
+                        </pic:blipFill>
+                        <pic:spPr>
+                          <a:xfrm>
+                            <a:off x="0" y="0"/>
+                            <a:ext cx="5577840" cy="3486150"/>
+                          </a:xfrm>
+                          <a:prstGeom prst="rect"/>
+                        </pic:spPr>
+                      </pic:pic>
+                    </a:graphicData>
+                  </a:graphic>
+                </wp:inline>
+              </w:drawing>
+            </w:r>
+          </w:p>
+          <w:p>
+            <w:r>
+              <w:rPr>
+                <w:highlight w:val="yellow"/>
+              </w:rPr>
+              <w:t>Figure 2: Select Open on the Agentic AI module card.</w:t>
+            </w:r>
+          </w:p>
+        </w:tc>
+      </w:tr>
+    </w:tbl>
+    <w:tbl>
+      <w:tblPr>
+        <w:tblW w:type="auto" w:w="0"/>
+        <w:tblLook w:firstColumn="1" w:firstRow="1" w:lastColumn="0" w:lastRow="0" w:noHBand="0" w:noVBand="1" w:val="04A0"/>
+      </w:tblPr>
+      <w:tblGrid>
+        <w:gridCol w:w="9633"/>
+      </w:tblGrid>
+      <w:tr>
+        <w:tc>
+          <w:tcPr>
+            <w:tcW w:type="dxa" w:w="9633"/>
+            <w:shd w:fill="FFFF00"/>
+          </w:tcPr>
+          <w:p>
+            <w:pPr>
+              <w:jc w:val="center"/>
+            </w:pPr>
+            <w:r>
+              <w:drawing>
+                <wp:inline xmlns:a="http://schemas.openxmlformats.org/drawingml/2006/main" xmlns:pic="http://schemas.openxmlformats.org/drawingml/2006/picture">
+                  <wp:extent cx="5577840" cy="3486150"/>
+                  <wp:docPr id="5" name="Picture 5"/>
+                  <wp:cNvGraphicFramePr>
+                    <a:graphicFrameLocks noChangeAspect="1"/>
+                  </wp:cNvGraphicFramePr>
+                  <a:graphic>
+                    <a:graphicData uri="http://schemas.openxmlformats.org/drawingml/2006/picture">
+                      <pic:pic>
+                        <pic:nvPicPr>
+                          <pic:cNvPr id="0" name="criterion-1-final.png"/>
+                          <pic:cNvPicPr/>
+                        </pic:nvPicPr>
+                        <pic:blipFill>
+                          <a:blip r:embed="rId12"/>
+                          <a:stretch>
+                            <a:fillRect/>
+                          </a:stretch>
+                        </pic:blipFill>
+                        <pic:spPr>
+                          <a:xfrm>
+                            <a:off x="0" y="0"/>
+                            <a:ext cx="5577840" cy="3486150"/>
+                          </a:xfrm>
+                          <a:prstGeom prst="rect"/>
+                        </pic:spPr>
+                      </pic:pic>
+                    </a:graphicData>
+                  </a:graphic>
+                </wp:inline>
+              </w:drawing>
+            </w:r>
+          </w:p>
+          <w:p>
+            <w:r>
+              <w:rPr>
+                <w:highlight w:val="yellow"/>
+              </w:rPr>
+              <w:t>Figure 3: Confirm that the Agentic AI module opens at /agentic-ai.</w:t>
+            </w:r>
+          </w:p>
+        </w:tc>
+      </w:tr>
+    </w:tbl>
+    <w:p>
+      <w:r>
+        <w:rPr>
+          <w:vanish/>
+          <w:highlight w:val="yellow"/>
+        </w:rPr>
+        <w:t>[[AUTO_GUIDE_UPDATE:TEST2-28]]</w:t>
+      </w:r>
+    </w:p>
+    <w:p>
+      <w:pPr>
         <w:pStyle w:val="Caption"/>
       </w:pPr>
       <w:r>

</xml_diff>

<commit_message>
Publish TEST2 TEST2-34 agent output
</commit_message>
<xml_diff>
--- a/assets/user-guide/V4 User Guide.docx
+++ b/assets/user-guide/V4 User Guide.docx
@@ -3493,6 +3493,258 @@
     </w:p>
     <w:p>
       <w:pPr>
+        <w:pStyle w:val="Heading1"/>
+      </w:pPr>
+      <w:r>
+        <w:rPr>
+          <w:highlight w:val="yellow"/>
+        </w:rPr>
+        <w:t>Updated guidance: Open GIS from the V4 launcher</w:t>
+      </w:r>
+    </w:p>
+    <w:p>
+      <w:r>
+        <w:rPr>
+          <w:highlight w:val="yellow"/>
+        </w:rPr>
+        <w:t>Section: Opening GIS from the V4 launcher</w:t>
+      </w:r>
+    </w:p>
+    <w:p>
+      <w:r>
+        <w:rPr>
+          <w:highlight w:val="yellow"/>
+        </w:rPr>
+        <w:t>1. Open the V4 launcher.</w:t>
+      </w:r>
+    </w:p>
+    <w:p>
+      <w:r>
+        <w:rPr>
+          <w:highlight w:val="yellow"/>
+        </w:rPr>
+        <w:t>2. Select Open GIS on the GIS module card.</w:t>
+      </w:r>
+    </w:p>
+    <w:p>
+      <w:r>
+        <w:rPr>
+          <w:highlight w:val="yellow"/>
+        </w:rPr>
+        <w:t>3. Wait for the GIS page and map to load.</w:t>
+      </w:r>
+    </w:p>
+    <w:p>
+      <w:r>
+        <w:rPr>
+          <w:highlight w:val="yellow"/>
+        </w:rPr>
+        <w:t>4. Select the browser Back button to return to the launcher.</w:t>
+      </w:r>
+    </w:p>
+    <w:tbl>
+      <w:tblPr>
+        <w:tblW w:type="auto" w:w="0"/>
+        <w:tblLook w:firstColumn="1" w:firstRow="1" w:lastColumn="0" w:lastRow="0" w:noHBand="0" w:noVBand="1" w:val="04A0"/>
+      </w:tblPr>
+      <w:tblGrid>
+        <w:gridCol w:w="9633"/>
+      </w:tblGrid>
+      <w:tr>
+        <w:tc>
+          <w:tcPr>
+            <w:tcW w:type="dxa" w:w="9633"/>
+            <w:shd w:fill="FFFF00"/>
+          </w:tcPr>
+          <w:p>
+            <w:pPr>
+              <w:jc w:val="center"/>
+            </w:pPr>
+            <w:r>
+              <w:drawing>
+                <wp:inline xmlns:a="http://schemas.openxmlformats.org/drawingml/2006/main" xmlns:pic="http://schemas.openxmlformats.org/drawingml/2006/picture">
+                  <wp:extent cx="5577840" cy="3486150"/>
+                  <wp:docPr id="6" name="Picture 6"/>
+                  <wp:cNvGraphicFramePr>
+                    <a:graphicFrameLocks noChangeAspect="1"/>
+                  </wp:cNvGraphicFramePr>
+                  <a:graphic>
+                    <a:graphicData uri="http://schemas.openxmlformats.org/drawingml/2006/picture">
+                      <pic:pic>
+                        <pic:nvPicPr>
+                          <pic:cNvPr id="0" name="image.png"/>
+                          <pic:cNvPicPr/>
+                        </pic:nvPicPr>
+                        <pic:blipFill>
+                          <a:blip r:embed="rId12"/>
+                          <a:stretch>
+                            <a:fillRect/>
+                          </a:stretch>
+                        </pic:blipFill>
+                        <pic:spPr>
+                          <a:xfrm>
+                            <a:off x="0" y="0"/>
+                            <a:ext cx="5577840" cy="3486150"/>
+                          </a:xfrm>
+                          <a:prstGeom prst="rect"/>
+                        </pic:spPr>
+                      </pic:pic>
+                    </a:graphicData>
+                  </a:graphic>
+                </wp:inline>
+              </w:drawing>
+            </w:r>
+          </w:p>
+          <w:p>
+            <w:r>
+              <w:rPr>
+                <w:highlight w:val="yellow"/>
+              </w:rPr>
+              <w:t>Figure 1: Open the V4 launcher.</w:t>
+            </w:r>
+          </w:p>
+        </w:tc>
+      </w:tr>
+    </w:tbl>
+    <w:tbl>
+      <w:tblPr>
+        <w:tblW w:type="auto" w:w="0"/>
+        <w:tblLook w:firstColumn="1" w:firstRow="1" w:lastColumn="0" w:lastRow="0" w:noHBand="0" w:noVBand="1" w:val="04A0"/>
+      </w:tblPr>
+      <w:tblGrid>
+        <w:gridCol w:w="9633"/>
+      </w:tblGrid>
+      <w:tr>
+        <w:tc>
+          <w:tcPr>
+            <w:tcW w:type="dxa" w:w="9633"/>
+            <w:shd w:fill="FFFF00"/>
+          </w:tcPr>
+          <w:p>
+            <w:pPr>
+              <w:jc w:val="center"/>
+            </w:pPr>
+            <w:r>
+              <w:drawing>
+                <wp:inline xmlns:a="http://schemas.openxmlformats.org/drawingml/2006/main" xmlns:pic="http://schemas.openxmlformats.org/drawingml/2006/picture">
+                  <wp:extent cx="5577840" cy="3486150"/>
+                  <wp:docPr id="7" name="Picture 7"/>
+                  <wp:cNvGraphicFramePr>
+                    <a:graphicFrameLocks noChangeAspect="1"/>
+                  </wp:cNvGraphicFramePr>
+                  <a:graphic>
+                    <a:graphicData uri="http://schemas.openxmlformats.org/drawingml/2006/picture">
+                      <pic:pic>
+                        <pic:nvPicPr>
+                          <pic:cNvPr id="0" name="criterion-2-after-open.png"/>
+                          <pic:cNvPicPr/>
+                        </pic:nvPicPr>
+                        <pic:blipFill>
+                          <a:blip r:embed="rId14"/>
+                          <a:stretch>
+                            <a:fillRect/>
+                          </a:stretch>
+                        </pic:blipFill>
+                        <pic:spPr>
+                          <a:xfrm>
+                            <a:off x="0" y="0"/>
+                            <a:ext cx="5577840" cy="3486150"/>
+                          </a:xfrm>
+                          <a:prstGeom prst="rect"/>
+                        </pic:spPr>
+                      </pic:pic>
+                    </a:graphicData>
+                  </a:graphic>
+                </wp:inline>
+              </w:drawing>
+            </w:r>
+          </w:p>
+          <w:p>
+            <w:r>
+              <w:rPr>
+                <w:highlight w:val="yellow"/>
+              </w:rPr>
+              <w:t>Figure 2: Select Open GIS on the GIS module card.</w:t>
+            </w:r>
+          </w:p>
+        </w:tc>
+      </w:tr>
+    </w:tbl>
+    <w:tbl>
+      <w:tblPr>
+        <w:tblW w:type="auto" w:w="0"/>
+        <w:tblLook w:firstColumn="1" w:firstRow="1" w:lastColumn="0" w:lastRow="0" w:noHBand="0" w:noVBand="1" w:val="04A0"/>
+      </w:tblPr>
+      <w:tblGrid>
+        <w:gridCol w:w="9633"/>
+      </w:tblGrid>
+      <w:tr>
+        <w:tc>
+          <w:tcPr>
+            <w:tcW w:type="dxa" w:w="9633"/>
+            <w:shd w:fill="FFFF00"/>
+          </w:tcPr>
+          <w:p>
+            <w:pPr>
+              <w:jc w:val="center"/>
+            </w:pPr>
+            <w:r>
+              <w:drawing>
+                <wp:inline xmlns:a="http://schemas.openxmlformats.org/drawingml/2006/main" xmlns:pic="http://schemas.openxmlformats.org/drawingml/2006/picture">
+                  <wp:extent cx="5577840" cy="3486150"/>
+                  <wp:docPr id="8" name="Picture 8"/>
+                  <wp:cNvGraphicFramePr>
+                    <a:graphicFrameLocks noChangeAspect="1"/>
+                  </wp:cNvGraphicFramePr>
+                  <a:graphic>
+                    <a:graphicData uri="http://schemas.openxmlformats.org/drawingml/2006/picture">
+                      <pic:pic>
+                        <pic:nvPicPr>
+                          <pic:cNvPr id="0" name="criterion-3-final.png"/>
+                          <pic:cNvPicPr/>
+                        </pic:nvPicPr>
+                        <pic:blipFill>
+                          <a:blip r:embed="rId15"/>
+                          <a:stretch>
+                            <a:fillRect/>
+                          </a:stretch>
+                        </pic:blipFill>
+                        <pic:spPr>
+                          <a:xfrm>
+                            <a:off x="0" y="0"/>
+                            <a:ext cx="5577840" cy="3486150"/>
+                          </a:xfrm>
+                          <a:prstGeom prst="rect"/>
+                        </pic:spPr>
+                      </pic:pic>
+                    </a:graphicData>
+                  </a:graphic>
+                </wp:inline>
+              </w:drawing>
+            </w:r>
+          </w:p>
+          <w:p>
+            <w:r>
+              <w:rPr>
+                <w:highlight w:val="yellow"/>
+              </w:rPr>
+              <w:t>Figure 3: Wait for the GIS page and map to load.</w:t>
+            </w:r>
+          </w:p>
+        </w:tc>
+      </w:tr>
+    </w:tbl>
+    <w:p>
+      <w:r>
+        <w:rPr>
+          <w:vanish/>
+          <w:highlight w:val="yellow"/>
+        </w:rPr>
+        <w:t>[[AUTO_GUIDE_UPDATE:TEST2-34]]</w:t>
+      </w:r>
+    </w:p>
+    <w:p>
+      <w:pPr>
         <w:pStyle w:val="Caption"/>
       </w:pPr>
       <w:r>

</xml_diff>